<commit_message>
Add shared gradient background and refresh both code guides
</commit_message>
<xml_diff>
--- a/documentation/PulseGuard_Code_Mission_References.docx
+++ b/documentation/PulseGuard_Code_Mission_References.docx
@@ -30,7 +30,7 @@
     </w:p>
     <w:p>
       <w:r>
-        <w:t>Updated September 6 2026 against the edited local repository, based on GitHub revision 0fd57fd664bd. References describe this generated source snapshot. Parenthetical references count physical source lines, including blanks. Links open the accompanying code_reference_snapshot files; the reference manifest records their SHA256 hashes.</w:t>
+        <w:t>Updated September 6 2026 against the edited local repository, based on GitHub revision 1e05b4d07fd4. References describe this generated source snapshot. Parenthetical references count physical source lines, including blanks. Links open the accompanying code_reference_snapshot files; the reference manifest records their SHA256 hashes.</w:t>
       </w:r>
     </w:p>
     <w:p>
@@ -3800,7 +3800,7 @@
           <w:rPr>
             <w:color w:val="245A81"/>
           </w:rPr>
-          <w:t>(site.css, line 463)</w:t>
+          <w:t>(site.css, line 12)</w:t>
         </w:r>
       </w:hyperlink>
     </w:p>
@@ -3813,7 +3813,7 @@
           <w:rFonts w:ascii="Consolas" w:hAnsi="Consolas"/>
           <w:sz w:val="18"/>
         </w:rPr>
-        <w:t>outline: 3px solid var(--blue);</w:t>
+        <w:t>--page-background: radial-gradient(ellipse at 12% 0%, rgba(43, 112, 126, .24), transparent 52%),</w:t>
       </w:r>
     </w:p>
     <w:p>
@@ -3827,7 +3827,7 @@
         <w:t xml:space="preserve">Individual meaning  </w:t>
       </w:r>
       <w:r>
-        <w:t>This declaration draws a three-pixel outline using the blue custom property within the focus-visible rule.</w:t>
+        <w:t>Defines the shared page background as a translucent teal radial glow over a navy-to-charcoal linear gradient.</w:t>
       </w:r>
     </w:p>
     <w:p>
@@ -3841,7 +3841,7 @@
         <w:t xml:space="preserve">Contribution to the file  </w:t>
       </w:r>
       <w:r>
-        <w:t>It marks the focused button or link for keyboard interaction.</w:t>
+        <w:t>The final body rule applies this variable with a fixed background and a minimum viewport height.</w:t>
       </w:r>
     </w:p>
     <w:p>
@@ -3852,7 +3852,7 @@
         <w:t xml:space="preserve">Mission relevance  </w:t>
       </w:r>
       <w:r>
-        <w:t>Visible focus helps people locate and activate safety controls.</w:t>
+        <w:t>A consistent, restrained backdrop keeps the existing controls readable across the site; it does not change detection or emergency behavior.</w:t>
       </w:r>
     </w:p>
     <w:p>
@@ -3864,7 +3864,7 @@
           <w:rPr>
             <w:color w:val="245A81"/>
           </w:rPr>
-          <w:t>(site.css, line 1126)</w:t>
+          <w:t>(site.css, line 467)</w:t>
         </w:r>
       </w:hyperlink>
     </w:p>
@@ -3877,7 +3877,7 @@
           <w:rFonts w:ascii="Consolas" w:hAnsi="Consolas"/>
           <w:sz w:val="18"/>
         </w:rPr>
-        <w:t>.care-dialog { width: min(430px, calc(100% - 32px)); padding: 24px; background: #202122; color: var(--text); border: 1px solid var(--line); }</w:t>
+        <w:t>outline: 3px solid var(--blue);</w:t>
       </w:r>
     </w:p>
     <w:p>
@@ -3891,7 +3891,7 @@
         <w:t xml:space="preserve">Individual meaning  </w:t>
       </w:r>
       <w:r>
-        <w:t>The selector targets care dialogs. min limits width to 430 pixels or the viewport minus 32 pixels; other declarations set padding, colors and border.</w:t>
+        <w:t>This declaration draws a three-pixel outline using the blue custom property within the focus-visible rule.</w:t>
       </w:r>
     </w:p>
     <w:p>
@@ -3905,7 +3905,7 @@
         <w:t xml:space="preserve">Contribution to the file  </w:t>
       </w:r>
       <w:r>
-        <w:t>It sizes and styles the prompt opened when the drop alarm stops.</w:t>
+        <w:t>It marks the focused button or link for keyboard interaction.</w:t>
       </w:r>
     </w:p>
     <w:p>
@@ -3916,7 +3916,7 @@
         <w:t xml:space="preserve">Mission relevance  </w:t>
       </w:r>
       <w:r>
-        <w:t>A readable prompt helps the person choose a next action, but CSS does not request care.</w:t>
+        <w:t>Visible focus helps people locate and activate safety controls.</w:t>
       </w:r>
     </w:p>
     <w:p>
@@ -4128,7 +4128,7 @@
           <w:rPr>
             <w:color w:val="245A81"/>
           </w:rPr>
-          <w:t>(styles.css, line 785)</w:t>
+          <w:t>(styles.css, line 47)</w:t>
         </w:r>
       </w:hyperlink>
     </w:p>
@@ -4141,7 +4141,7 @@
           <w:rFonts w:ascii="Consolas" w:hAnsi="Consolas"/>
           <w:sz w:val="18"/>
         </w:rPr>
-        <w:t>.choice-grid { display: grid; grid-template-columns: repeat(3, 1fr); gap: 14px; }</w:t>
+        <w:t>background: var(--page-background);</w:t>
       </w:r>
     </w:p>
     <w:p>
@@ -4155,7 +4155,7 @@
         <w:t xml:space="preserve">Individual meaning  </w:t>
       </w:r>
       <w:r>
-        <w:t>The rule creates a grid with three equally sized columns and fourteen-pixel gaps.</w:t>
+        <w:t>Uses the shared gradient instead of replacing it with the dashboard’s old background.</w:t>
       </w:r>
     </w:p>
     <w:p>
@@ -4169,7 +4169,7 @@
         <w:t xml:space="preserve">Contribution to the file  </w:t>
       </w:r>
       <w:r>
-        <w:t>It lays out the three homepage choice cards on wider screens.</w:t>
+        <w:t>The homepage and tracker now use the same background treatment while retaining their layouts.</w:t>
       </w:r>
     </w:p>
     <w:p>
@@ -4180,7 +4180,7 @@
         <w:t xml:space="preserve">Mission relevance  </w:t>
       </w:r>
       <w:r>
-        <w:t>It makes the manual, bystander and support choices easier to compare.</w:t>
+        <w:t>Consistent presentation helps users recognize the same service across pages.</w:t>
       </w:r>
     </w:p>
     <w:p>
@@ -4192,7 +4192,7 @@
           <w:rPr>
             <w:color w:val="245A81"/>
           </w:rPr>
-          <w:t>(styles.css, line 826)</w:t>
+          <w:t>(styles.css, line 782)</w:t>
         </w:r>
       </w:hyperlink>
     </w:p>
@@ -4205,7 +4205,7 @@
           <w:rFonts w:ascii="Consolas" w:hAnsi="Consolas"/>
           <w:sz w:val="18"/>
         </w:rPr>
-        <w:t>.choice-grid, .sequence-list, .local-facts { grid-template-columns: 1fr; }</w:t>
+        <w:t>.choice-grid { display: grid; grid-template-columns: repeat(3, 1fr); gap: 14px; }</w:t>
       </w:r>
     </w:p>
     <w:p>
@@ -4219,7 +4219,7 @@
         <w:t xml:space="preserve">Individual meaning  </w:t>
       </w:r>
       <w:r>
-        <w:t>Inside the max-width 800px media query, the rule changes these grids to one column.</w:t>
+        <w:t>The rule creates a grid with three equally sized columns and fourteen-pixel gaps.</w:t>
       </w:r>
     </w:p>
     <w:p>
@@ -4233,7 +4233,7 @@
         <w:t xml:space="preserve">Contribution to the file  </w:t>
       </w:r>
       <w:r>
-        <w:t>The homepage stacks choices and explanatory sections on narrower screens.</w:t>
+        <w:t>It lays out the three homepage choice cards on wider screens.</w:t>
       </w:r>
     </w:p>
     <w:p>
@@ -4244,7 +4244,7 @@
         <w:t xml:space="preserve">Mission relevance  </w:t>
       </w:r>
       <w:r>
-        <w:t>It helps keep the safety actions readable on phones.</w:t>
+        <w:t>It makes the manual, bystander and support choices easier to compare.</w:t>
       </w:r>
     </w:p>
     <w:p>
@@ -5205,6 +5205,11 @@
     <w:p>
       <w:r>
         <w:t>Safeguard is the current site name. The Team block, Who built what heading, name placeholders and AI assistance disclosure are absent from About and the README. The original requested opening paragraph remains removed from the tracker.</w:t>
+      </w:r>
+    </w:p>
+    <w:p>
+      <w:r>
+        <w:t>The shared website background now blends a soft teal glow with navy and charcoal. Both stylesheets use the same CSS variable so the homepage, About page and tracker retain a consistent gradient. Existing cards, typography, controls and detection behavior are preserved.</w:t>
       </w:r>
     </w:p>
     <w:p>

</xml_diff>

<commit_message>
Show AED venue names and addresses and refresh code guides
</commit_message>
<xml_diff>
--- a/documentation/PulseGuard_Code_Mission_References.docx
+++ b/documentation/PulseGuard_Code_Mission_References.docx
@@ -30,7 +30,7 @@
     </w:p>
     <w:p>
       <w:r>
-        <w:t>Updated September 6 2026 against the edited local repository, based on GitHub revision 1e05b4d07fd4. References describe this generated source snapshot. Parenthetical references count physical source lines, including blanks. Links open the accompanying code_reference_snapshot files; the reference manifest records their SHA256 hashes.</w:t>
+        <w:t>Updated September 6 2026 against the edited local repository, based on GitHub revision 7fa6a424306a. References describe this generated source snapshot. Parenthetical references count physical source lines, including blanks. Links open the accompanying code_reference_snapshot files; the reference manifest records their SHA256 hashes.</w:t>
       </w:r>
     </w:p>
     <w:p>
@@ -1292,7 +1292,7 @@
           <w:rPr>
             <w:color w:val="245A81"/>
           </w:rPr>
-          <w:t>(app.js, line 278)</w:t>
+          <w:t>(app.js, line 255)</w:t>
         </w:r>
       </w:hyperlink>
     </w:p>
@@ -1305,7 +1305,7 @@
           <w:rFonts w:ascii="Consolas" w:hAnsi="Consolas"/>
           <w:sz w:val="18"/>
         </w:rPr>
-        <w:t>const query = '[out:json][timeout:20];nwr["emergency"="defibrillator"](around:10000,' + origin.lat + ',' + origin.lon + ');out center tags;';</w:t>
+        <w:t>function insideBuilding(point, geometry) {</w:t>
       </w:r>
     </w:p>
     <w:p>
@@ -1319,7 +1319,7 @@
         <w:t xml:space="preserve">Individual meaning  </w:t>
       </w:r>
       <w:r>
-        <w:t>Builds an Overpass query for objects tagged emergency=defibrillator within 10 km of the latest fix.</w:t>
+        <w:t>Tests whether an AED coordinate lies within a closed mapped building outline.</w:t>
       </w:r>
     </w:p>
     <w:p>
@@ -1333,7 +1333,7 @@
         <w:t xml:space="preserve">Contribution to the file  </w:t>
       </w:r>
       <w:r>
-        <w:t>Searches mapped AED records rather than the old ZIP’s example data or mixed hospital results.</w:t>
+        <w:t>The ray crossing calculation establishes containment before a building name can be attached.</w:t>
       </w:r>
     </w:p>
     <w:p>
@@ -1344,7 +1344,7 @@
         <w:t xml:space="preserve">Mission relevance  </w:t>
       </w:r>
       <w:r>
-        <w:t>Shortens the search for nearby equipment while retaining coverage and access limitations.</w:t>
+        <w:t>Helps a responder identify the mapped place without assuming a nearby business contains the AED.</w:t>
       </w:r>
     </w:p>
     <w:p>
@@ -1356,7 +1356,7 @@
           <w:rPr>
             <w:color w:val="245A81"/>
           </w:rPr>
-          <w:t>(app.js, line 286)</w:t>
+          <w:t>(app.js, line 288)</w:t>
         </w:r>
       </w:hyperlink>
     </w:p>
@@ -1369,7 +1369,7 @@
           <w:rFonts w:ascii="Consolas" w:hAnsi="Consolas"/>
           <w:sz w:val="18"/>
         </w:rPr>
-        <w:t>if (request !== aedRequest) return;</w:t>
+        <w:t>const host = buildings.filter(b =&gt; b.tags?.building &amp;&amp; insideBuilding(item, b.geometry))</w:t>
       </w:r>
     </w:p>
     <w:p>
@@ -1383,7 +1383,7 @@
         <w:t xml:space="preserve">Individual meaning  </w:t>
       </w:r>
       <w:r>
-        <w:t>Rejects an obsolete asynchronous AED response.</w:t>
+        <w:t>Selects only mapped buildings containing the AED coordinate.</w:t>
       </w:r>
     </w:p>
     <w:p>
@@ -1397,7 +1397,7 @@
         <w:t xml:space="preserve">Contribution to the file  </w:t>
       </w:r>
       <w:r>
-        <w:t>A newer search or stopping the tracker invalidates prior requests.</w:t>
+        <w:t>The smallest containing outline supplies building metadata; no nearest-business shortcut is used.</w:t>
       </w:r>
     </w:p>
     <w:p>
@@ -1408,7 +1408,7 @@
         <w:t xml:space="preserve">Mission relevance  </w:t>
       </w:r>
       <w:r>
-        <w:t>Prevents old results from replacing the current location context.</w:t>
+        <w:t>Makes location guidance more specific while preserving uncertainty in public map records.</w:t>
       </w:r>
     </w:p>
     <w:p>
@@ -1433,7 +1433,7 @@
           <w:rFonts w:ascii="Consolas" w:hAnsi="Consolas"/>
           <w:sz w:val="18"/>
         </w:rPr>
-        <w:t>.sort((a, b) =&gt; a.distance - b.distance).slice(0, 5);</w:t>
+        <w:t>const name = host?.tags?.name || recordedName || address || "AED at " + item.lat.toFixed(5) + ", " + item.lon.toFixed(5);</w:t>
       </w:r>
     </w:p>
     <w:p>
@@ -1447,7 +1447,7 @@
         <w:t xml:space="preserve">Individual meaning  </w:t>
       </w:r>
       <w:r>
-        <w:t>Sorts numerical distances ascending and retains at most five entries.</w:t>
+        <w:t>Chooses the mapped building name, then an AED name, address or coordinate fallback.</w:t>
       </w:r>
     </w:p>
     <w:p>
@@ -1461,7 +1461,7 @@
         <w:t xml:space="preserve">Contribution to the file  </w:t>
       </w:r>
       <w:r>
-        <w:t>The ordered list and numbered map popups use the same closest-first result set.</w:t>
+        <w:t>Indoor hints such as outside the restrooms remain separate from the place title.</w:t>
       </w:r>
     </w:p>
     <w:p>
@@ -1472,7 +1472,7 @@
         <w:t xml:space="preserve">Mission relevance  </w:t>
       </w:r>
       <w:r>
-        <w:t>Prioritizes nearby AEDs; the distances are straight-line estimates, not walking routes.</w:t>
+        <w:t>Supports finding the correct destination before following the final indoor directions.</w:t>
       </w:r>
     </w:p>
     <w:p>
@@ -1484,7 +1484,7 @@
           <w:rPr>
             <w:color w:val="245A81"/>
           </w:rPr>
-          <w:t>(app.js, line 309)</w:t>
+          <w:t>(app.js, line 323)</w:t>
         </w:r>
       </w:hyperlink>
     </w:p>
@@ -1497,7 +1497,7 @@
           <w:rFonts w:ascii="Consolas" w:hAnsi="Consolas"/>
           <w:sz w:val="18"/>
         </w:rPr>
-        <w:t>detail.textContent = Math.round(item.distance) + " m straight-line · Access: " + (tags.access || "not recorded") + " · Hours: " + (tags.opening_hours || "not recorded");</w:t>
+        <w:t>const venueQuery = '[out:json][timeout:6];(' + boxes.join("") + ');out geom tags;';</w:t>
       </w:r>
     </w:p>
     <w:p>
@@ -1511,7 +1511,7 @@
         <w:t xml:space="preserve">Individual meaning  </w:t>
       </w:r>
       <w:r>
-        <w:t>Writes distance, access and opening-hours metadata as plain text.</w:t>
+        <w:t>Batches small building searches around the five AED coordinates.</w:t>
       </w:r>
     </w:p>
     <w:p>
@@ -1525,7 +1525,7 @@
         <w:t xml:space="preserve">Contribution to the file  </w:t>
       </w:r>
       <w:r>
-        <w:t>Missing access or hours are displayed as not recorded.</w:t>
+        <w:t>One additional Overpass request retrieves outlines and tags, with an eight-second client timeout.</w:t>
       </w:r>
     </w:p>
     <w:p>
@@ -1536,7 +1536,7 @@
         <w:t xml:space="preserve">Mission relevance  </w:t>
       </w:r>
       <w:r>
-        <w:t>Helps the user assess a mapped location without claiming the AED is currently available.</w:t>
+        <w:t>Adds recognizable locations without holding up results indefinitely when the provider fails.</w:t>
       </w:r>
     </w:p>
     <w:p>
@@ -1548,7 +1548,7 @@
           <w:rPr>
             <w:color w:val="245A81"/>
           </w:rPr>
-          <w:t>(app.js, line 426)</w:t>
+          <w:t>(app.js, line 349)</w:t>
         </w:r>
       </w:hyperlink>
     </w:p>
@@ -1561,7 +1561,7 @@
           <w:rFonts w:ascii="Consolas" w:hAnsi="Consolas"/>
           <w:sz w:val="18"/>
         </w:rPr>
-        <w:t>if (Math.abs(mag - 9.81) &gt; RECOVERY_MS2) {</w:t>
+        <w:t>if (complete) aedVenueCache.set(key(item), { details, expires: Date.now() + 600000 });</w:t>
       </w:r>
     </w:p>
     <w:p>
@@ -1575,7 +1575,7 @@
         <w:t xml:space="preserve">Individual meaning  </w:t>
       </w:r>
       <w:r>
-        <w:t>Compares movement away from resting gravity with the recovery threshold.</w:t>
+        <w:t>Caches a successful place lookup for ten minutes in memory.</w:t>
       </w:r>
     </w:p>
     <w:p>
@@ -1589,7 +1589,7 @@
         <w:t xml:space="preserve">Contribution to the file  </w:t>
       </w:r>
       <w:r>
-        <w:t>Resumed movement clears the pending drop and returns to monitoring.</w:t>
+        <w:t>Repeat searches reuse venue details; failed lookups remain retryable and the cache is capped at 128 entries.</w:t>
       </w:r>
     </w:p>
     <w:p>
@@ -1600,7 +1600,7 @@
         <w:t xml:space="preserve">Mission relevance  </w:t>
       </w:r>
       <w:r>
-        <w:t>Implements the mobile screen’s recovery cancellation behavior.</w:t>
+        <w:t>Reduces waiting and remote requests while keeping location context temporary.</w:t>
       </w:r>
     </w:p>
     <w:p>
@@ -1612,7 +1612,7 @@
           <w:rPr>
             <w:color w:val="245A81"/>
           </w:rPr>
-          <w:t>(app.js, line 441)</w:t>
+          <w:t>(app.js, line 383)</w:t>
         </w:r>
       </w:hyperlink>
     </w:p>
@@ -1625,7 +1625,7 @@
           <w:rFonts w:ascii="Consolas" w:hAnsi="Consolas"/>
           <w:sz w:val="18"/>
         </w:rPr>
-        <w:t>if (Date.now() - stillSince &gt;= STILL_MS) fire("stillness");</w:t>
+        <w:t>const query = '[out:json][timeout:20];nwr["emergency"="defibrillator"](around:10000,' + origin.lat + ',' + origin.lon + ');out center tags;';</w:t>
       </w:r>
     </w:p>
     <w:p>
@@ -1639,7 +1639,7 @@
         <w:t xml:space="preserve">Individual meaning  </w:t>
       </w:r>
       <w:r>
-        <w:t>Checks elapsed stillness against eight seconds.</w:t>
+        <w:t>Builds an Overpass query for objects tagged emergency=defibrillator within 10 km of the latest fix.</w:t>
       </w:r>
     </w:p>
     <w:p>
@@ -1653,7 +1653,7 @@
         <w:t xml:space="preserve">Contribution to the file  </w:t>
       </w:r>
       <w:r>
-        <w:t>Records stillness, which allows the guarded check-in to begin.</w:t>
+        <w:t>Searches mapped AED records rather than the old ZIP’s example data or mixed hospital results.</w:t>
       </w:r>
     </w:p>
     <w:p>
@@ -1664,7 +1664,7 @@
         <w:t xml:space="preserve">Mission relevance  </w:t>
       </w:r>
       <w:r>
-        <w:t>Adds a second observation before escalation.</w:t>
+        <w:t>Shortens the search for nearby equipment while retaining coverage and access limitations.</w:t>
       </w:r>
     </w:p>
     <w:p>
@@ -1676,7 +1676,7 @@
           <w:rPr>
             <w:color w:val="245A81"/>
           </w:rPr>
-          <w:t>(app.js, line 644)</w:t>
+          <w:t>(app.js, line 391)</w:t>
         </w:r>
       </w:hyperlink>
     </w:p>
@@ -1689,7 +1689,7 @@
           <w:rFonts w:ascii="Consolas" w:hAnsi="Consolas"/>
           <w:sz w:val="18"/>
         </w:rPr>
-        <w:t>place = { lat: c.latitude, lon: c.longitude, acc: Math.ceil(c.accuracy), at: p.timestamp };</w:t>
+        <w:t>if (request !== aedRequest) return;</w:t>
       </w:r>
     </w:p>
     <w:p>
@@ -1703,7 +1703,7 @@
         <w:t xml:space="preserve">Individual meaning  </w:t>
       </w:r>
       <w:r>
-        <w:t>Stores latitude, longitude, accuracy and timestamp.</w:t>
+        <w:t>Rejects an obsolete asynchronous AED response.</w:t>
       </w:r>
     </w:p>
     <w:p>
@@ -1717,7 +1717,7 @@
         <w:t xml:space="preserve">Contribution to the file  </w:t>
       </w:r>
       <w:r>
-        <w:t>Text readouts and the satellite marker use the same validated fix.</w:t>
+        <w:t>A newer search or stopping the tracker invalidates prior requests.</w:t>
       </w:r>
     </w:p>
     <w:p>
@@ -1728,7 +1728,7 @@
         <w:t xml:space="preserve">Mission relevance  </w:t>
       </w:r>
       <w:r>
-        <w:t>Shows where the device is estimated to be without hiding positional uncertainty.</w:t>
+        <w:t>Prevents old results from replacing the current location context.</w:t>
       </w:r>
     </w:p>
     <w:p>
@@ -1740,7 +1740,7 @@
           <w:rPr>
             <w:color w:val="245A81"/>
           </w:rPr>
-          <w:t>(app.js, line 697)</w:t>
+          <w:t>(app.js, line 399)</w:t>
         </w:r>
       </w:hyperlink>
     </w:p>
@@ -1753,7 +1753,7 @@
           <w:rFonts w:ascii="Consolas" w:hAnsi="Consolas"/>
           <w:sz w:val="18"/>
         </w:rPr>
-        <w:t>accuracyCircle = L.circle(point, { radius: place.acc, color: "#69b7ff", fillOpacity: 0.12 }).addTo(satelliteMap);</w:t>
+        <w:t>.sort((a, b) =&gt; a.distance - b.distance).slice(0, 5);</w:t>
       </w:r>
     </w:p>
     <w:p>
@@ -1767,7 +1767,7 @@
         <w:t xml:space="preserve">Individual meaning  </w:t>
       </w:r>
       <w:r>
-        <w:t>Draws the reported accuracy radius in metres.</w:t>
+        <w:t>Sorts numerical distances ascending and retains at most five entries.</w:t>
       </w:r>
     </w:p>
     <w:p>
@@ -1781,7 +1781,7 @@
         <w:t xml:space="preserve">Contribution to the file  </w:t>
       </w:r>
       <w:r>
-        <w:t>The circle surrounds the live location marker.</w:t>
+        <w:t>The ordered list and numbered map popups use the same closest-first result set.</w:t>
       </w:r>
     </w:p>
     <w:p>
@@ -1792,7 +1792,7 @@
         <w:t xml:space="preserve">Mission relevance  </w:t>
       </w:r>
       <w:r>
-        <w:t>Makes uncertainty visible; satellite imagery itself is not live tracking.</w:t>
+        <w:t>Prioritizes nearby AEDs; the distances are straight-line estimates, not walking routes.</w:t>
       </w:r>
     </w:p>
     <w:p>
@@ -1804,7 +1804,7 @@
           <w:rPr>
             <w:color w:val="245A81"/>
           </w:rPr>
-          <w:t>(app.js, line 707)</w:t>
+          <w:t>(app.js, line 419)</w:t>
         </w:r>
       </w:hyperlink>
     </w:p>
@@ -1817,7 +1817,7 @@
           <w:rFonts w:ascii="Consolas" w:hAnsi="Consolas"/>
           <w:sz w:val="18"/>
         </w:rPr>
-        <w:t>if ((!aedOrigin &amp;&amp; Date.now() - aedAttemptAt &gt; 30000) || (aedOrigin &amp;&amp; metresBetween(aedOrigin, place) &gt; 100)) listNearestCare();</w:t>
+        <w:t>detail.textContent = Math.round(item.distance) + " m straight-line · Access: " + (tags.access || "not recorded") + " · Hours: " + (tags.opening_hours || "not recorded");</w:t>
       </w:r>
     </w:p>
     <w:p>
@@ -1831,7 +1831,7 @@
         <w:t xml:space="preserve">Individual meaning  </w:t>
       </w:r>
       <w:r>
-        <w:t>Refreshes AED records on the first fix or after moving more than 100 metres.</w:t>
+        <w:t>Writes distance, access and opening-hours metadata as plain text.</w:t>
       </w:r>
     </w:p>
     <w:p>
@@ -1845,7 +1845,7 @@
         <w:t xml:space="preserve">Contribution to the file  </w:t>
       </w:r>
       <w:r>
-        <w:t>Avoids querying the remote service for every sensor update.</w:t>
+        <w:t>Missing access or hours are displayed as not recorded.</w:t>
       </w:r>
     </w:p>
     <w:p>
@@ -1856,7 +1856,7 @@
         <w:t xml:space="preserve">Mission relevance  </w:t>
       </w:r>
       <w:r>
-        <w:t>Keeps nearby equipment relevant while limiting unnecessary network requests.</w:t>
+        <w:t>Helps the user assess a mapped location without claiming the AED is currently available.</w:t>
       </w:r>
     </w:p>
     <w:p>
@@ -1868,7 +1868,7 @@
           <w:rPr>
             <w:color w:val="245A81"/>
           </w:rPr>
-          <w:t>(app.js, line 725)</w:t>
+          <w:t>(app.js, line 423)</w:t>
         </w:r>
       </w:hyperlink>
     </w:p>
@@ -1881,7 +1881,7 @@
           <w:rFonts w:ascii="Consolas" w:hAnsi="Consolas"/>
           <w:sz w:val="18"/>
         </w:rPr>
-        <w:t>locationWatch = navigator.geolocation.watchPosition(p =&gt; {</w:t>
+        <w:t>locationDetail.textContent = [venue.address !== name ? venue.address : "", venue.directions].filter(Boolean).join(" · ");</w:t>
       </w:r>
     </w:p>
     <w:p>
@@ -1895,7 +1895,7 @@
         <w:t xml:space="preserve">Individual meaning  </w:t>
       </w:r>
       <w:r>
-        <w:t>Subscribes to browser location updates.</w:t>
+        <w:t>Combines the mapped street address with recorded indoor directions as plain text.</w:t>
       </w:r>
     </w:p>
     <w:p>
@@ -1909,7 +1909,7 @@
         <w:t xml:space="preserve">Contribution to the file  </w:t>
       </w:r>
       <w:r>
-        <w:t>The marker follows reported positions until Stop tracker or page exit.</w:t>
+        <w:t>The ordered result keeps distance, AED access and AED hours on a separate line.</w:t>
       </w:r>
     </w:p>
     <w:p>
@@ -1920,7 +1920,7 @@
         <w:t xml:space="preserve">Mission relevance  </w:t>
       </w:r>
       <w:r>
-        <w:t>Keeps location context ready for a human response, subject to permission and device accuracy.</w:t>
+        <w:t>Helps a person locate equipment without confusing building opening hours with AED availability.</w:t>
       </w:r>
     </w:p>
     <w:p>
@@ -1932,7 +1932,7 @@
           <w:rPr>
             <w:color w:val="245A81"/>
           </w:rPr>
-          <w:t>(app.js, line 726)</w:t>
+          <w:t>(app.js, line 544)</w:t>
         </w:r>
       </w:hyperlink>
     </w:p>
@@ -1945,7 +1945,7 @@
           <w:rFonts w:ascii="Consolas" w:hAnsi="Consolas"/>
           <w:sz w:val="18"/>
         </w:rPr>
-        <w:t>if (run === session) showPosition(p);</w:t>
+        <w:t>if (Math.abs(mag - 9.81) &gt; RECOVERY_MS2) {</w:t>
       </w:r>
     </w:p>
     <w:p>
@@ -1959,7 +1959,7 @@
         <w:t xml:space="preserve">Individual meaning  </w:t>
       </w:r>
       <w:r>
-        <w:t>Checks that the location callback belongs to the current session.</w:t>
+        <w:t>Compares movement away from resting gravity with the recovery threshold.</w:t>
       </w:r>
     </w:p>
     <w:p>
@@ -1973,7 +1973,7 @@
         <w:t xml:space="preserve">Contribution to the file  </w:t>
       </w:r>
       <w:r>
-        <w:t>Location can run separately from motion, including on a laptop without motion sensors.</w:t>
+        <w:t>Resumed movement clears the pending drop and returns to monitoring.</w:t>
       </w:r>
     </w:p>
     <w:p>
@@ -1984,7 +1984,7 @@
         <w:t xml:space="preserve">Mission relevance  </w:t>
       </w:r>
       <w:r>
-        <w:t>Preserves useful location support even when drop detection is unavailable.</w:t>
+        <w:t>Implements the mobile screen’s recovery cancellation behavior.</w:t>
       </w:r>
     </w:p>
     <w:p>
@@ -1996,7 +1996,7 @@
           <w:rPr>
             <w:color w:val="245A81"/>
           </w:rPr>
-          <w:t>(app.js, line 769)</w:t>
+          <w:t>(app.js, line 559)</w:t>
         </w:r>
       </w:hyperlink>
     </w:p>
@@ -2009,7 +2009,7 @@
           <w:rFonts w:ascii="Consolas" w:hAnsi="Consolas"/>
           <w:sz w:val="18"/>
         </w:rPr>
-        <w:t>fired.noReply = true;</w:t>
+        <w:t>if (Date.now() - stillSince &gt;= STILL_MS) fire("stillness");</w:t>
       </w:r>
     </w:p>
     <w:p>
@@ -2023,7 +2023,7 @@
         <w:t xml:space="preserve">Individual meaning  </w:t>
       </w:r>
       <w:r>
-        <w:t>Records that the check-in expired without a response.</w:t>
+        <w:t>Checks elapsed stillness against eight seconds.</w:t>
       </w:r>
     </w:p>
     <w:p>
@@ -2037,7 +2037,7 @@
         <w:t xml:space="preserve">Contribution to the file  </w:t>
       </w:r>
       <w:r>
-        <w:t>The next statements prepare a message and start warning playback.</w:t>
+        <w:t>Records stillness, which allows the guarded check-in to begin.</w:t>
       </w:r>
     </w:p>
     <w:p>
@@ -2048,7 +2048,7 @@
         <w:t xml:space="preserve">Mission relevance  </w:t>
       </w:r>
       <w:r>
-        <w:t>Connects verification to an actionable, manually sent message.</w:t>
+        <w:t>Adds a second observation before escalation.</w:t>
       </w:r>
     </w:p>
     <w:p>
@@ -2060,7 +2060,391 @@
           <w:rPr>
             <w:color w:val="245A81"/>
           </w:rPr>
-          <w:t>(app.js, line 855)</w:t>
+          <w:t>(app.js, line 763)</w:t>
+        </w:r>
+      </w:hyperlink>
+    </w:p>
+    <w:p>
+      <w:pPr>
+        <w:keepNext/>
+      </w:pPr>
+      <w:r>
+        <w:rPr>
+          <w:rFonts w:ascii="Consolas" w:hAnsi="Consolas"/>
+          <w:sz w:val="18"/>
+        </w:rPr>
+        <w:t>place = { lat: c.latitude, lon: c.longitude, acc: Math.ceil(c.accuracy), at: p.timestamp };</w:t>
+      </w:r>
+    </w:p>
+    <w:p>
+      <w:pPr>
+        <w:keepNext/>
+      </w:pPr>
+      <w:r>
+        <w:rPr>
+          <w:b/>
+        </w:rPr>
+        <w:t xml:space="preserve">Individual meaning  </w:t>
+      </w:r>
+      <w:r>
+        <w:t>Stores latitude, longitude, accuracy and timestamp.</w:t>
+      </w:r>
+    </w:p>
+    <w:p>
+      <w:pPr>
+        <w:keepNext/>
+      </w:pPr>
+      <w:r>
+        <w:rPr>
+          <w:b/>
+        </w:rPr>
+        <w:t xml:space="preserve">Contribution to the file  </w:t>
+      </w:r>
+      <w:r>
+        <w:t>Text readouts and the satellite marker use the same validated fix.</w:t>
+      </w:r>
+    </w:p>
+    <w:p>
+      <w:r>
+        <w:rPr>
+          <w:b/>
+        </w:rPr>
+        <w:t xml:space="preserve">Mission relevance  </w:t>
+      </w:r>
+      <w:r>
+        <w:t>Shows where the device is estimated to be without hiding positional uncertainty.</w:t>
+      </w:r>
+    </w:p>
+    <w:p>
+      <w:pPr>
+        <w:keepNext/>
+      </w:pPr>
+      <w:hyperlink r:id="rId14">
+        <w:r>
+          <w:rPr>
+            <w:color w:val="245A81"/>
+          </w:rPr>
+          <w:t>(app.js, line 816)</w:t>
+        </w:r>
+      </w:hyperlink>
+    </w:p>
+    <w:p>
+      <w:pPr>
+        <w:keepNext/>
+      </w:pPr>
+      <w:r>
+        <w:rPr>
+          <w:rFonts w:ascii="Consolas" w:hAnsi="Consolas"/>
+          <w:sz w:val="18"/>
+        </w:rPr>
+        <w:t>accuracyCircle = L.circle(point, { radius: place.acc, color: "#69b7ff", fillOpacity: 0.12 }).addTo(satelliteMap);</w:t>
+      </w:r>
+    </w:p>
+    <w:p>
+      <w:pPr>
+        <w:keepNext/>
+      </w:pPr>
+      <w:r>
+        <w:rPr>
+          <w:b/>
+        </w:rPr>
+        <w:t xml:space="preserve">Individual meaning  </w:t>
+      </w:r>
+      <w:r>
+        <w:t>Draws the reported accuracy radius in metres.</w:t>
+      </w:r>
+    </w:p>
+    <w:p>
+      <w:pPr>
+        <w:keepNext/>
+      </w:pPr>
+      <w:r>
+        <w:rPr>
+          <w:b/>
+        </w:rPr>
+        <w:t xml:space="preserve">Contribution to the file  </w:t>
+      </w:r>
+      <w:r>
+        <w:t>The circle surrounds the live location marker.</w:t>
+      </w:r>
+    </w:p>
+    <w:p>
+      <w:r>
+        <w:rPr>
+          <w:b/>
+        </w:rPr>
+        <w:t xml:space="preserve">Mission relevance  </w:t>
+      </w:r>
+      <w:r>
+        <w:t>Makes uncertainty visible; satellite imagery itself is not live tracking.</w:t>
+      </w:r>
+    </w:p>
+    <w:p>
+      <w:pPr>
+        <w:keepNext/>
+      </w:pPr>
+      <w:hyperlink r:id="rId14">
+        <w:r>
+          <w:rPr>
+            <w:color w:val="245A81"/>
+          </w:rPr>
+          <w:t>(app.js, line 825)</w:t>
+        </w:r>
+      </w:hyperlink>
+    </w:p>
+    <w:p>
+      <w:pPr>
+        <w:keepNext/>
+      </w:pPr>
+      <w:r>
+        <w:rPr>
+          <w:rFonts w:ascii="Consolas" w:hAnsi="Consolas"/>
+          <w:sz w:val="18"/>
+        </w:rPr>
+        <w:t>if ((!aedOrigin &amp;&amp; Date.now() - aedAttemptAt &gt; 30000) || (aedOrigin &amp;&amp; metresBetween(aedOrigin, place) &gt; 100)) listNearestCare();</w:t>
+      </w:r>
+    </w:p>
+    <w:p>
+      <w:pPr>
+        <w:keepNext/>
+      </w:pPr>
+      <w:r>
+        <w:rPr>
+          <w:b/>
+        </w:rPr>
+        <w:t xml:space="preserve">Individual meaning  </w:t>
+      </w:r>
+      <w:r>
+        <w:t>Refreshes AED records on the first fix or after moving more than 100 metres.</w:t>
+      </w:r>
+    </w:p>
+    <w:p>
+      <w:pPr>
+        <w:keepNext/>
+      </w:pPr>
+      <w:r>
+        <w:rPr>
+          <w:b/>
+        </w:rPr>
+        <w:t xml:space="preserve">Contribution to the file  </w:t>
+      </w:r>
+      <w:r>
+        <w:t>Avoids querying the remote service for every sensor update.</w:t>
+      </w:r>
+    </w:p>
+    <w:p>
+      <w:r>
+        <w:rPr>
+          <w:b/>
+        </w:rPr>
+        <w:t xml:space="preserve">Mission relevance  </w:t>
+      </w:r>
+      <w:r>
+        <w:t>Keeps nearby equipment relevant while limiting unnecessary network requests.</w:t>
+      </w:r>
+    </w:p>
+    <w:p>
+      <w:pPr>
+        <w:keepNext/>
+      </w:pPr>
+      <w:hyperlink r:id="rId14">
+        <w:r>
+          <w:rPr>
+            <w:color w:val="245A81"/>
+          </w:rPr>
+          <w:t>(app.js, line 843)</w:t>
+        </w:r>
+      </w:hyperlink>
+    </w:p>
+    <w:p>
+      <w:pPr>
+        <w:keepNext/>
+      </w:pPr>
+      <w:r>
+        <w:rPr>
+          <w:rFonts w:ascii="Consolas" w:hAnsi="Consolas"/>
+          <w:sz w:val="18"/>
+        </w:rPr>
+        <w:t>locationWatch = navigator.geolocation.watchPosition(p =&gt; {</w:t>
+      </w:r>
+    </w:p>
+    <w:p>
+      <w:pPr>
+        <w:keepNext/>
+      </w:pPr>
+      <w:r>
+        <w:rPr>
+          <w:b/>
+        </w:rPr>
+        <w:t xml:space="preserve">Individual meaning  </w:t>
+      </w:r>
+      <w:r>
+        <w:t>Subscribes to browser location updates.</w:t>
+      </w:r>
+    </w:p>
+    <w:p>
+      <w:pPr>
+        <w:keepNext/>
+      </w:pPr>
+      <w:r>
+        <w:rPr>
+          <w:b/>
+        </w:rPr>
+        <w:t xml:space="preserve">Contribution to the file  </w:t>
+      </w:r>
+      <w:r>
+        <w:t>The marker follows reported positions until Stop tracker or page exit.</w:t>
+      </w:r>
+    </w:p>
+    <w:p>
+      <w:r>
+        <w:rPr>
+          <w:b/>
+        </w:rPr>
+        <w:t xml:space="preserve">Mission relevance  </w:t>
+      </w:r>
+      <w:r>
+        <w:t>Keeps location context ready for a human response, subject to permission and device accuracy.</w:t>
+      </w:r>
+    </w:p>
+    <w:p>
+      <w:pPr>
+        <w:keepNext/>
+      </w:pPr>
+      <w:hyperlink r:id="rId14">
+        <w:r>
+          <w:rPr>
+            <w:color w:val="245A81"/>
+          </w:rPr>
+          <w:t>(app.js, line 844)</w:t>
+        </w:r>
+      </w:hyperlink>
+    </w:p>
+    <w:p>
+      <w:pPr>
+        <w:keepNext/>
+      </w:pPr>
+      <w:r>
+        <w:rPr>
+          <w:rFonts w:ascii="Consolas" w:hAnsi="Consolas"/>
+          <w:sz w:val="18"/>
+        </w:rPr>
+        <w:t>if (run === session) showPosition(p);</w:t>
+      </w:r>
+    </w:p>
+    <w:p>
+      <w:pPr>
+        <w:keepNext/>
+      </w:pPr>
+      <w:r>
+        <w:rPr>
+          <w:b/>
+        </w:rPr>
+        <w:t xml:space="preserve">Individual meaning  </w:t>
+      </w:r>
+      <w:r>
+        <w:t>Checks that the location callback belongs to the current session.</w:t>
+      </w:r>
+    </w:p>
+    <w:p>
+      <w:pPr>
+        <w:keepNext/>
+      </w:pPr>
+      <w:r>
+        <w:rPr>
+          <w:b/>
+        </w:rPr>
+        <w:t xml:space="preserve">Contribution to the file  </w:t>
+      </w:r>
+      <w:r>
+        <w:t>Location can run separately from motion, including on a laptop without motion sensors.</w:t>
+      </w:r>
+    </w:p>
+    <w:p>
+      <w:r>
+        <w:rPr>
+          <w:b/>
+        </w:rPr>
+        <w:t xml:space="preserve">Mission relevance  </w:t>
+      </w:r>
+      <w:r>
+        <w:t>Preserves useful location support even when drop detection is unavailable.</w:t>
+      </w:r>
+    </w:p>
+    <w:p>
+      <w:pPr>
+        <w:keepNext/>
+      </w:pPr>
+      <w:hyperlink r:id="rId14">
+        <w:r>
+          <w:rPr>
+            <w:color w:val="245A81"/>
+          </w:rPr>
+          <w:t>(app.js, line 888)</w:t>
+        </w:r>
+      </w:hyperlink>
+    </w:p>
+    <w:p>
+      <w:pPr>
+        <w:keepNext/>
+      </w:pPr>
+      <w:r>
+        <w:rPr>
+          <w:rFonts w:ascii="Consolas" w:hAnsi="Consolas"/>
+          <w:sz w:val="18"/>
+        </w:rPr>
+        <w:t>fired.noReply = true;</w:t>
+      </w:r>
+    </w:p>
+    <w:p>
+      <w:pPr>
+        <w:keepNext/>
+      </w:pPr>
+      <w:r>
+        <w:rPr>
+          <w:b/>
+        </w:rPr>
+        <w:t xml:space="preserve">Individual meaning  </w:t>
+      </w:r>
+      <w:r>
+        <w:t>Records that the check-in expired without a response.</w:t>
+      </w:r>
+    </w:p>
+    <w:p>
+      <w:pPr>
+        <w:keepNext/>
+      </w:pPr>
+      <w:r>
+        <w:rPr>
+          <w:b/>
+        </w:rPr>
+        <w:t xml:space="preserve">Contribution to the file  </w:t>
+      </w:r>
+      <w:r>
+        <w:t>The next statements prepare a message and start warning playback.</w:t>
+      </w:r>
+    </w:p>
+    <w:p>
+      <w:r>
+        <w:rPr>
+          <w:b/>
+        </w:rPr>
+        <w:t xml:space="preserve">Mission relevance  </w:t>
+      </w:r>
+      <w:r>
+        <w:t>Connects verification to an actionable, manually sent message.</w:t>
+      </w:r>
+    </w:p>
+    <w:p>
+      <w:pPr>
+        <w:keepNext/>
+      </w:pPr>
+      <w:hyperlink r:id="rId14">
+        <w:r>
+          <w:rPr>
+            <w:color w:val="245A81"/>
+          </w:rPr>
+          <w:t>(app.js, line 973)</w:t>
         </w:r>
       </w:hyperlink>
     </w:p>
@@ -5230,6 +5614,11 @@
     <w:p>
       <w:r>
         <w:t>An OpenStreetMap Overpass query finds up to five AED records within 10 km, sorted by straight-line distance. It refreshes after movement exceeding 100 metres or on request. Missing records are not filled with examples. Availability and access are not verified. Coordinates are sent to the third-party map and AED services to obtain results.</w:t>
+      </w:r>
+    </w:p>
+    <w:p>
+      <w:r>
+        <w:t>AED rows now show mapped building names and street addresses, with indoor directions beneath them. A second batched Overpass query retrieves nearby building outlines; only an outline containing the AED coordinate can supply a building name. The five supplied coordinates match Redmond Senior &amp; Community Center and Redmond City Hall in the inspected map data. Names come from OpenStreetMap; Google Maps links target the exact AED coordinates. Unmapped names fall back to the recorded AED name, address or coordinates. Building hours are never substituted for AED access hours. Successful name lookups expire after ten minutes in memory; lookup failures preserve the AED results.</w:t>
       </w:r>
     </w:p>
     <w:p>

</xml_diff>

<commit_message>
Update both feature guides for separate account flows
</commit_message>
<xml_diff>
--- a/documentation/PulseGuard_Code_Mission_References.docx
+++ b/documentation/PulseGuard_Code_Mission_References.docx
@@ -17,7 +17,7 @@
     </w:p>
     <w:p>
       <w:r>
-        <w:t>Source snapshot c12375414436. Line counts include comments and blank lines. Linked references open the exact GitHub revision. The full reference is for questions and review; reading every code line aloud would exceed one minute forty seconds.</w:t>
+        <w:t>Source snapshot f1adb61dcefb. Line counts include comments and blank lines. Linked references open the exact GitHub revision. The full reference is for questions and review; reading every code line aloud would exceed one minute forty seconds.</w:t>
       </w:r>
     </w:p>
     <w:p>
@@ -88,7 +88,7 @@
         <w:t xml:space="preserve">15 to 30 seconds  </w:t>
       </w:r>
       <w:r>
-        <w:t>In site dot CSS, line twelve defines the teal and navy gradient. Shared styles organize cards, buttons, and keyboard focus. Mobile rules stack choices. Navigation connects the pages, while account forms remain demonstrations.</w:t>
+        <w:t>In site dot CSS, line twelve defines the teal and navy gradient. Shared styles organize cards, buttons, and keyboard focus. Mobile rules stack choices. Navigation connects the pages, while account setup awaits configuration.</w:t>
       </w:r>
     </w:p>
     <w:p>
@@ -2009,7 +2009,7 @@
         <w:pStyle w:val="Heading1"/>
       </w:pPr>
       <w:r>
-        <w:t>Homepage and account demonstration</w:t>
+        <w:t>Homepage and account access</w:t>
       </w:r>
     </w:p>
     <w:p>
@@ -2585,7 +2585,7 @@
           <w:rPr>
             <w:color w:val="245A81"/>
           </w:rPr>
-          <w:t>(index.html, line 144)</w:t>
+          <w:t>(index.html, line 160)</w:t>
         </w:r>
       </w:hyperlink>
     </w:p>
@@ -2610,7 +2610,7 @@
           <w:rPr>
             <w:color w:val="245A81"/>
           </w:rPr>
-          <w:t>(index.html, line 157)</w:t>
+          <w:t>(index.html, line 174)</w:t>
         </w:r>
       </w:hyperlink>
     </w:p>
@@ -2656,7 +2656,7 @@
         <w:pStyle w:val="Heading2"/>
       </w:pPr>
       <w:r>
-        <w:t>Login and signup forms</w:t>
+        <w:t>Separate sign in and sign up boxes</w:t>
       </w:r>
     </w:p>
     <w:p>
@@ -2668,7 +2668,7 @@
           <w:rPr>
             <w:color w:val="245A81"/>
           </w:rPr>
-          <w:t>(index.html, line 112)</w:t>
+          <w:t>(index.html, line 118)</w:t>
         </w:r>
       </w:hyperlink>
     </w:p>
@@ -2681,7 +2681,7 @@
           <w:rFonts w:ascii="Consolas" w:hAnsi="Consolas"/>
           <w:sz w:val="18"/>
         </w:rPr>
-        <w:t>&lt;form class="auth-form" id="login-form" aria-labelledby="login-tab"&gt;</w:t>
+        <w:t>&lt;form class="auth-form auth-box" id="login-form" aria-labelledby="login-heading"&gt;</w:t>
       </w:r>
     </w:p>
     <w:p>
@@ -2689,31 +2689,6 @@
         <w:keepNext/>
       </w:pPr>
       <w:hyperlink r:id="rId77">
-        <w:r>
-          <w:rPr>
-            <w:color w:val="245A81"/>
-          </w:rPr>
-          <w:t>(auth.js, line 13)</w:t>
-        </w:r>
-      </w:hyperlink>
-    </w:p>
-    <w:p>
-      <w:pPr>
-        <w:keepNext/>
-      </w:pPr>
-      <w:r>
-        <w:rPr>
-          <w:rFonts w:ascii="Consolas" w:hAnsi="Consolas"/>
-          <w:sz w:val="18"/>
-        </w:rPr>
-        <w:t>loginForm.hidden = !showLogin;</w:t>
-      </w:r>
-    </w:p>
-    <w:p>
-      <w:pPr>
-        <w:keepNext/>
-      </w:pPr>
-      <w:hyperlink r:id="rId78">
         <w:r>
           <w:rPr>
             <w:color w:val="245A81"/>
@@ -2731,6 +2706,31 @@
           <w:rFonts w:ascii="Consolas" w:hAnsi="Consolas"/>
           <w:sz w:val="18"/>
         </w:rPr>
+        <w:t>loginForm.hidden = !showLogin;</w:t>
+      </w:r>
+    </w:p>
+    <w:p>
+      <w:pPr>
+        <w:keepNext/>
+      </w:pPr>
+      <w:hyperlink r:id="rId78">
+        <w:r>
+          <w:rPr>
+            <w:color w:val="245A81"/>
+          </w:rPr>
+          <w:t>(auth.js, line 16)</w:t>
+        </w:r>
+      </w:hyperlink>
+    </w:p>
+    <w:p>
+      <w:pPr>
+        <w:keepNext/>
+      </w:pPr>
+      <w:r>
+        <w:rPr>
+          <w:rFonts w:ascii="Consolas" w:hAnsi="Consolas"/>
+          <w:sz w:val="18"/>
+        </w:rPr>
         <w:t>signupForm.hidden = showLogin;</w:t>
       </w:r>
     </w:p>
@@ -2745,7 +2745,7 @@
         <w:t xml:space="preserve">What this does  </w:t>
       </w:r>
       <w:r>
-        <w:t>The HTML defines the form and the script switches which form is visible when a tab is selected.</w:t>
+        <w:t>Each flow has its own bordered form and Google button. Switching tabs hides the other form, including its fields and status.</w:t>
       </w:r>
     </w:p>
     <w:p>
@@ -2756,7 +2756,7 @@
         <w:t xml:space="preserve">Mission relevance  </w:t>
       </w:r>
       <w:r>
-        <w:t>Demonstrates account navigation; it does not enable a protected account.</w:t>
+        <w:t>Keeps the chosen account action clear without combining sign-in and registration fields.</w:t>
       </w:r>
     </w:p>
     <w:p>
@@ -2801,7 +2801,7 @@
           <w:rPr>
             <w:color w:val="245A81"/>
           </w:rPr>
-          <w:t>(auth.js, line 49)</w:t>
+          <w:t>(auth.js, line 55)</w:t>
         </w:r>
       </w:hyperlink>
     </w:p>
@@ -2839,7 +2839,7 @@
         <w:t xml:space="preserve">Mission relevance  </w:t>
       </w:r>
       <w:r>
-        <w:t>Keeps an optional account demonstration separate from monitoring.</w:t>
+        <w:t>Keeps account access separate from monitoring.</w:t>
       </w:r>
     </w:p>
     <w:p>
@@ -2847,7 +2847,7 @@
         <w:pStyle w:val="Heading2"/>
       </w:pPr>
       <w:r>
-        <w:t>Account submission boundary</w:t>
+        <w:t>Email authentication and password handling</w:t>
       </w:r>
     </w:p>
     <w:p>
@@ -2859,7 +2859,7 @@
           <w:rPr>
             <w:color w:val="245A81"/>
           </w:rPr>
-          <w:t>(auth.js, line 64)</w:t>
+          <w:t>(auth.js, line 128)</w:t>
         </w:r>
       </w:hyperlink>
     </w:p>
@@ -2872,7 +2872,7 @@
           <w:rFonts w:ascii="Consolas" w:hAnsi="Consolas"/>
           <w:sz w:val="18"/>
         </w:rPr>
-        <w:t>authStatus.textContent = "Accounts are not connected yet. Nothing was sent or saved.";</w:t>
+        <w:t>const result = google ? await identity.google() : await identity[kind](form.elements.email.value.trim(), form.elements.password.value);</w:t>
       </w:r>
     </w:p>
     <w:p>
@@ -2884,7 +2884,7 @@
           <w:rPr>
             <w:color w:val="245A81"/>
           </w:rPr>
-          <w:t>(auth.js, line 67)</w:t>
+          <w:t>(auth-provider.js, line 18)</w:t>
         </w:r>
       </w:hyperlink>
     </w:p>
@@ -2897,7 +2897,32 @@
           <w:rFonts w:ascii="Consolas" w:hAnsi="Consolas"/>
           <w:sz w:val="18"/>
         </w:rPr>
-        <w:t>input.value = "";</w:t>
+        <w:t>login: (email, password) =&gt; signInWithEmailAndPassword(auth, email, password),</w:t>
+      </w:r>
+    </w:p>
+    <w:p>
+      <w:pPr>
+        <w:keepNext/>
+      </w:pPr>
+      <w:hyperlink r:id="rId83">
+        <w:r>
+          <w:rPr>
+            <w:color w:val="245A81"/>
+          </w:rPr>
+          <w:t>(auth-provider.js, line 19)</w:t>
+        </w:r>
+      </w:hyperlink>
+    </w:p>
+    <w:p>
+      <w:pPr>
+        <w:keepNext/>
+      </w:pPr>
+      <w:r>
+        <w:rPr>
+          <w:rFonts w:ascii="Consolas" w:hAnsi="Consolas"/>
+          <w:sz w:val="18"/>
+        </w:rPr>
+        <w:t>signup: (email, password) =&gt; createUserWithEmailAndPassword(auth, email, password),</w:t>
       </w:r>
     </w:p>
     <w:p>
@@ -2911,7 +2936,7 @@
         <w:t xml:space="preserve">What this does  </w:t>
       </w:r>
       <w:r>
-        <w:t>Submission reports that no account was created and clears password inputs. The handler prevents normal form submission.</w:t>
+        <w:t>When configured, the provider signs in existing users or creates email accounts with Firebase. Password fields are cleared after each completed attempt and are never saved by the UI. The public Firebase configuration is currently missing, so real authentication is unavailable.</w:t>
       </w:r>
     </w:p>
     <w:p>
@@ -2922,7 +2947,414 @@
         <w:t xml:space="preserve">Mission relevance  </w:t>
       </w:r>
       <w:r>
-        <w:t>Avoids claiming an account or remote protection service has been activated.</w:t>
+        <w:t>Supports authenticated account access without claiming that an unconfigured form has signed anyone in.</w:t>
+      </w:r>
+    </w:p>
+    <w:p>
+      <w:pPr>
+        <w:pStyle w:val="Heading2"/>
+      </w:pPr>
+      <w:r>
+        <w:t>Requested sign in fields</w:t>
+      </w:r>
+    </w:p>
+    <w:p>
+      <w:pPr>
+        <w:keepNext/>
+      </w:pPr>
+      <w:hyperlink r:id="rId84">
+        <w:r>
+          <w:rPr>
+            <w:color w:val="245A81"/>
+          </w:rPr>
+          <w:t>(index.html, line 124)</w:t>
+        </w:r>
+      </w:hyperlink>
+    </w:p>
+    <w:p>
+      <w:pPr>
+        <w:keepNext/>
+      </w:pPr>
+      <w:r>
+        <w:rPr>
+          <w:rFonts w:ascii="Consolas" w:hAnsi="Consolas"/>
+          <w:sz w:val="18"/>
+        </w:rPr>
+        <w:t>&lt;input id="login-email" name="email" type="email" autocomplete="username" required&gt;</w:t>
+      </w:r>
+    </w:p>
+    <w:p>
+      <w:pPr>
+        <w:keepNext/>
+      </w:pPr>
+      <w:hyperlink r:id="rId85">
+        <w:r>
+          <w:rPr>
+            <w:color w:val="245A81"/>
+          </w:rPr>
+          <w:t>(index.html, line 127)</w:t>
+        </w:r>
+      </w:hyperlink>
+    </w:p>
+    <w:p>
+      <w:pPr>
+        <w:keepNext/>
+      </w:pPr>
+      <w:r>
+        <w:rPr>
+          <w:rFonts w:ascii="Consolas" w:hAnsi="Consolas"/>
+          <w:sz w:val="18"/>
+        </w:rPr>
+        <w:t>&lt;input id="login-password" name="password" type="password" autocomplete="current-password" required&gt;</w:t>
+      </w:r>
+    </w:p>
+    <w:p>
+      <w:pPr>
+        <w:keepNext/>
+      </w:pPr>
+      <w:r>
+        <w:rPr>
+          <w:b/>
+        </w:rPr>
+        <w:t xml:space="preserve">What this does  </w:t>
+      </w:r>
+      <w:r>
+        <w:t>The sign-in box contains only Email and Password inputs, plus its separate Google and submit buttons.</w:t>
+      </w:r>
+    </w:p>
+    <w:p>
+      <w:r>
+        <w:rPr>
+          <w:b/>
+        </w:rPr>
+        <w:t xml:space="preserve">Mission relevance  </w:t>
+      </w:r>
+      <w:r>
+        <w:t>Avoids asking returning users to repeat registration details.</w:t>
+      </w:r>
+    </w:p>
+    <w:p>
+      <w:pPr>
+        <w:pStyle w:val="Heading2"/>
+      </w:pPr>
+      <w:r>
+        <w:t>Requested sign up fields</w:t>
+      </w:r>
+    </w:p>
+    <w:p>
+      <w:pPr>
+        <w:keepNext/>
+      </w:pPr>
+      <w:hyperlink r:id="rId86">
+        <w:r>
+          <w:rPr>
+            <w:color w:val="245A81"/>
+          </w:rPr>
+          <w:t>(index.html, line 139)</w:t>
+        </w:r>
+      </w:hyperlink>
+    </w:p>
+    <w:p>
+      <w:pPr>
+        <w:keepNext/>
+      </w:pPr>
+      <w:r>
+        <w:rPr>
+          <w:rFonts w:ascii="Consolas" w:hAnsi="Consolas"/>
+          <w:sz w:val="18"/>
+        </w:rPr>
+        <w:t>&lt;input id="signup-first-name" name="firstName" type="text" autocomplete="given-name" maxlength="100" required&gt;</w:t>
+      </w:r>
+    </w:p>
+    <w:p>
+      <w:pPr>
+        <w:keepNext/>
+      </w:pPr>
+      <w:hyperlink r:id="rId87">
+        <w:r>
+          <w:rPr>
+            <w:color w:val="245A81"/>
+          </w:rPr>
+          <w:t>(index.html, line 142)</w:t>
+        </w:r>
+      </w:hyperlink>
+    </w:p>
+    <w:p>
+      <w:pPr>
+        <w:keepNext/>
+      </w:pPr>
+      <w:r>
+        <w:rPr>
+          <w:rFonts w:ascii="Consolas" w:hAnsi="Consolas"/>
+          <w:sz w:val="18"/>
+        </w:rPr>
+        <w:t>&lt;input id="signup-last-name" name="lastName" type="text" autocomplete="family-name" maxlength="100" required&gt;</w:t>
+      </w:r>
+    </w:p>
+    <w:p>
+      <w:pPr>
+        <w:keepNext/>
+      </w:pPr>
+      <w:hyperlink r:id="rId88">
+        <w:r>
+          <w:rPr>
+            <w:color w:val="245A81"/>
+          </w:rPr>
+          <w:t>(index.html, line 146)</w:t>
+        </w:r>
+      </w:hyperlink>
+    </w:p>
+    <w:p>
+      <w:pPr>
+        <w:keepNext/>
+      </w:pPr>
+      <w:r>
+        <w:rPr>
+          <w:rFonts w:ascii="Consolas" w:hAnsi="Consolas"/>
+          <w:sz w:val="18"/>
+        </w:rPr>
+        <w:t>&lt;label for="signup-password"&gt;Create a password&lt;/label&gt;</w:t>
+      </w:r>
+    </w:p>
+    <w:p>
+      <w:pPr>
+        <w:keepNext/>
+      </w:pPr>
+      <w:r>
+        <w:rPr>
+          <w:b/>
+        </w:rPr>
+        <w:t xml:space="preserve">What this does  </w:t>
+      </w:r>
+      <w:r>
+        <w:t>Registration contains First name, Last name, Email and Create a password. The provider saves the joined names as the Firebase display name after successful email account creation.</w:t>
+      </w:r>
+    </w:p>
+    <w:p>
+      <w:r>
+        <w:rPr>
+          <w:b/>
+        </w:rPr>
+        <w:t xml:space="preserve">Mission relevance  </w:t>
+      </w:r>
+      <w:r>
+        <w:t>Collects a readable account identity without changing the saved emergency contact.</w:t>
+      </w:r>
+    </w:p>
+    <w:p>
+      <w:pPr>
+        <w:pStyle w:val="Heading2"/>
+      </w:pPr>
+      <w:r>
+        <w:t>Google sign in and Google sign up</w:t>
+      </w:r>
+    </w:p>
+    <w:p>
+      <w:pPr>
+        <w:keepNext/>
+      </w:pPr>
+      <w:hyperlink r:id="rId89">
+        <w:r>
+          <w:rPr>
+            <w:color w:val="245A81"/>
+          </w:rPr>
+          <w:t>(index.html, line 120)</w:t>
+        </w:r>
+      </w:hyperlink>
+    </w:p>
+    <w:p>
+      <w:pPr>
+        <w:keepNext/>
+      </w:pPr>
+      <w:r>
+        <w:rPr>
+          <w:rFonts w:ascii="Consolas" w:hAnsi="Consolas"/>
+          <w:sz w:val="18"/>
+        </w:rPr>
+        <w:t>&lt;button class="google-auth" type="button" data-google="login"&gt;Sign in with Google&lt;/button&gt;</w:t>
+      </w:r>
+    </w:p>
+    <w:p>
+      <w:pPr>
+        <w:keepNext/>
+      </w:pPr>
+      <w:hyperlink r:id="rId90">
+        <w:r>
+          <w:rPr>
+            <w:color w:val="245A81"/>
+          </w:rPr>
+          <w:t>(index.html, line 135)</w:t>
+        </w:r>
+      </w:hyperlink>
+    </w:p>
+    <w:p>
+      <w:pPr>
+        <w:keepNext/>
+      </w:pPr>
+      <w:r>
+        <w:rPr>
+          <w:rFonts w:ascii="Consolas" w:hAnsi="Consolas"/>
+          <w:sz w:val="18"/>
+        </w:rPr>
+        <w:t>&lt;button class="google-auth" type="button" data-google="signup"&gt;Sign up with Google&lt;/button&gt;</w:t>
+      </w:r>
+    </w:p>
+    <w:p>
+      <w:pPr>
+        <w:keepNext/>
+      </w:pPr>
+      <w:hyperlink r:id="rId91">
+        <w:r>
+          <w:rPr>
+            <w:color w:val="245A81"/>
+          </w:rPr>
+          <w:t>(auth-provider.js, line 17)</w:t>
+        </w:r>
+      </w:hyperlink>
+    </w:p>
+    <w:p>
+      <w:pPr>
+        <w:keepNext/>
+      </w:pPr>
+      <w:r>
+        <w:rPr>
+          <w:rFonts w:ascii="Consolas" w:hAnsi="Consolas"/>
+          <w:sz w:val="18"/>
+        </w:rPr>
+        <w:t>google: () =&gt; signInWithPopup(auth, google),</w:t>
+      </w:r>
+    </w:p>
+    <w:p>
+      <w:pPr>
+        <w:keepNext/>
+      </w:pPr>
+      <w:r>
+        <w:rPr>
+          <w:b/>
+        </w:rPr>
+        <w:t xml:space="preserve">What this does  </w:t>
+      </w:r>
+      <w:r>
+        <w:t>Each box has its own Google option. Both use the Google account chooser; Firebase creates an account on first authentication and signs in a returning user afterward. The Google flow does not require the email form fields. It awaits the owner’s Firebase setup.</w:t>
+      </w:r>
+    </w:p>
+    <w:p>
+      <w:r>
+        <w:rPr>
+          <w:b/>
+        </w:rPr>
+        <w:t xml:space="preserve">Mission relevance  </w:t>
+      </w:r>
+      <w:r>
+        <w:t>Provides an alternative account path without collecting the Google password on this page.</w:t>
+      </w:r>
+    </w:p>
+    <w:p>
+      <w:pPr>
+        <w:pStyle w:val="Heading2"/>
+      </w:pPr>
+      <w:r>
+        <w:t>Authentication configuration and session</w:t>
+      </w:r>
+    </w:p>
+    <w:p>
+      <w:pPr>
+        <w:keepNext/>
+      </w:pPr>
+      <w:hyperlink r:id="rId92">
+        <w:r>
+          <w:rPr>
+            <w:color w:val="245A81"/>
+          </w:rPr>
+          <w:t>(auth-config.js, line 4)</w:t>
+        </w:r>
+      </w:hyperlink>
+    </w:p>
+    <w:p>
+      <w:pPr>
+        <w:keepNext/>
+      </w:pPr>
+      <w:r>
+        <w:rPr>
+          <w:rFonts w:ascii="Consolas" w:hAnsi="Consolas"/>
+          <w:sz w:val="18"/>
+        </w:rPr>
+        <w:t>window.SAFEGUARD_FIREBASE_CONFIG = null;</w:t>
+      </w:r>
+    </w:p>
+    <w:p>
+      <w:pPr>
+        <w:keepNext/>
+      </w:pPr>
+      <w:hyperlink r:id="rId93">
+        <w:r>
+          <w:rPr>
+            <w:color w:val="245A81"/>
+          </w:rPr>
+          <w:t>(auth-provider.js, line 9)</w:t>
+        </w:r>
+      </w:hyperlink>
+    </w:p>
+    <w:p>
+      <w:pPr>
+        <w:keepNext/>
+      </w:pPr>
+      <w:r>
+        <w:rPr>
+          <w:rFonts w:ascii="Consolas" w:hAnsi="Consolas"/>
+          <w:sz w:val="18"/>
+        </w:rPr>
+        <w:t>await setPersistence(auth, browserSessionPersistence);</w:t>
+      </w:r>
+    </w:p>
+    <w:p>
+      <w:pPr>
+        <w:keepNext/>
+      </w:pPr>
+      <w:hyperlink r:id="rId94">
+        <w:r>
+          <w:rPr>
+            <w:color w:val="245A81"/>
+          </w:rPr>
+          <w:t>(auth.js, line 168)</w:t>
+        </w:r>
+      </w:hyperlink>
+    </w:p>
+    <w:p>
+      <w:pPr>
+        <w:keepNext/>
+      </w:pPr>
+      <w:r>
+        <w:rPr>
+          <w:rFonts w:ascii="Consolas" w:hAnsi="Consolas"/>
+          <w:sz w:val="18"/>
+        </w:rPr>
+        <w:t>await identity.signout();</w:t>
+      </w:r>
+    </w:p>
+    <w:p>
+      <w:pPr>
+        <w:keepNext/>
+      </w:pPr>
+      <w:r>
+        <w:rPr>
+          <w:b/>
+        </w:rPr>
+        <w:t xml:space="preserve">What this does  </w:t>
+      </w:r>
+      <w:r>
+        <w:t>The null configuration keeps authentication unavailable until the owner supplies public web identifiers and enables providers. Once configured, Firebase verifies credentials, keeps the browser session and supports sign-out. Tracker contacts are not synced.</w:t>
+      </w:r>
+    </w:p>
+    <w:p>
+      <w:r>
+        <w:rPr>
+          <w:b/>
+        </w:rPr>
+        <w:t xml:space="preserve">Mission relevance  </w:t>
+      </w:r>
+      <w:r>
+        <w:t>Makes account state explicit and keeps it separate from active monitoring.</w:t>
       </w:r>
     </w:p>
     <w:p>
@@ -2945,7 +3377,7 @@
       <w:pPr>
         <w:keepNext/>
       </w:pPr>
-      <w:hyperlink r:id="rId83">
+      <w:hyperlink r:id="rId95">
         <w:r>
           <w:rPr>
             <w:color w:val="245A81"/>
@@ -2970,7 +3402,7 @@
       <w:pPr>
         <w:keepNext/>
       </w:pPr>
-      <w:hyperlink r:id="rId84">
+      <w:hyperlink r:id="rId96">
         <w:r>
           <w:rPr>
             <w:color w:val="245A81"/>
@@ -3028,7 +3460,7 @@
       <w:pPr>
         <w:keepNext/>
       </w:pPr>
-      <w:hyperlink r:id="rId85">
+      <w:hyperlink r:id="rId97">
         <w:r>
           <w:rPr>
             <w:color w:val="245A81"/>
@@ -3053,7 +3485,7 @@
       <w:pPr>
         <w:keepNext/>
       </w:pPr>
-      <w:hyperlink r:id="rId86">
+      <w:hyperlink r:id="rId98">
         <w:r>
           <w:rPr>
             <w:color w:val="245A81"/>
@@ -3111,7 +3543,7 @@
       <w:pPr>
         <w:keepNext/>
       </w:pPr>
-      <w:hyperlink r:id="rId87">
+      <w:hyperlink r:id="rId99">
         <w:r>
           <w:rPr>
             <w:color w:val="245A81"/>
@@ -3136,7 +3568,7 @@
       <w:pPr>
         <w:keepNext/>
       </w:pPr>
-      <w:hyperlink r:id="rId88">
+      <w:hyperlink r:id="rId100">
         <w:r>
           <w:rPr>
             <w:color w:val="245A81"/>
@@ -3194,7 +3626,7 @@
       <w:pPr>
         <w:keepNext/>
       </w:pPr>
-      <w:hyperlink r:id="rId89">
+      <w:hyperlink r:id="rId101">
         <w:r>
           <w:rPr>
             <w:color w:val="245A81"/>
@@ -3252,7 +3684,7 @@
       <w:pPr>
         <w:keepNext/>
       </w:pPr>
-      <w:hyperlink r:id="rId90">
+      <w:hyperlink r:id="rId102">
         <w:r>
           <w:rPr>
             <w:color w:val="245A81"/>
@@ -3335,7 +3767,7 @@
       <w:pPr>
         <w:keepNext/>
       </w:pPr>
-      <w:hyperlink r:id="rId91">
+      <w:hyperlink r:id="rId103">
         <w:r>
           <w:rPr>
             <w:color w:val="245A81"/>
@@ -3360,7 +3792,7 @@
       <w:pPr>
         <w:keepNext/>
       </w:pPr>
-      <w:hyperlink r:id="rId92">
+      <w:hyperlink r:id="rId104">
         <w:r>
           <w:rPr>
             <w:color w:val="245A81"/>
@@ -3418,7 +3850,7 @@
       <w:pPr>
         <w:keepNext/>
       </w:pPr>
-      <w:hyperlink r:id="rId93">
+      <w:hyperlink r:id="rId105">
         <w:r>
           <w:rPr>
             <w:color w:val="245A81"/>
@@ -3443,7 +3875,7 @@
       <w:pPr>
         <w:keepNext/>
       </w:pPr>
-      <w:hyperlink r:id="rId94">
+      <w:hyperlink r:id="rId106">
         <w:r>
           <w:rPr>
             <w:color w:val="245A81"/>
@@ -3501,7 +3933,7 @@
       <w:pPr>
         <w:keepNext/>
       </w:pPr>
-      <w:hyperlink r:id="rId95">
+      <w:hyperlink r:id="rId107">
         <w:r>
           <w:rPr>
             <w:color w:val="245A81"/>
@@ -3559,7 +3991,7 @@
       <w:pPr>
         <w:keepNext/>
       </w:pPr>
-      <w:hyperlink r:id="rId96">
+      <w:hyperlink r:id="rId108">
         <w:r>
           <w:rPr>
             <w:color w:val="245A81"/>
@@ -3642,7 +4074,7 @@
       <w:pPr>
         <w:keepNext/>
       </w:pPr>
-      <w:hyperlink r:id="rId97">
+      <w:hyperlink r:id="rId109">
         <w:r>
           <w:rPr>
             <w:color w:val="245A81"/>
@@ -3667,7 +4099,7 @@
       <w:pPr>
         <w:keepNext/>
       </w:pPr>
-      <w:hyperlink r:id="rId98">
+      <w:hyperlink r:id="rId110">
         <w:r>
           <w:rPr>
             <w:color w:val="245A81"/>
@@ -3725,7 +4157,7 @@
       <w:pPr>
         <w:keepNext/>
       </w:pPr>
-      <w:hyperlink r:id="rId99">
+      <w:hyperlink r:id="rId111">
         <w:r>
           <w:rPr>
             <w:color w:val="245A81"/>
@@ -3750,7 +4182,7 @@
       <w:pPr>
         <w:keepNext/>
       </w:pPr>
-      <w:hyperlink r:id="rId100">
+      <w:hyperlink r:id="rId112">
         <w:r>
           <w:rPr>
             <w:color w:val="245A81"/>
@@ -3833,7 +4265,7 @@
       <w:pPr>
         <w:keepNext/>
       </w:pPr>
-      <w:hyperlink r:id="rId101">
+      <w:hyperlink r:id="rId113">
         <w:r>
           <w:rPr>
             <w:color w:val="245A81"/>
@@ -3891,7 +4323,7 @@
       <w:pPr>
         <w:keepNext/>
       </w:pPr>
-      <w:hyperlink r:id="rId102">
+      <w:hyperlink r:id="rId114">
         <w:r>
           <w:rPr>
             <w:color w:val="245A81"/>
@@ -3916,7 +4348,7 @@
       <w:pPr>
         <w:keepNext/>
       </w:pPr>
-      <w:hyperlink r:id="rId103">
+      <w:hyperlink r:id="rId115">
         <w:r>
           <w:rPr>
             <w:color w:val="245A81"/>
@@ -3974,7 +4406,7 @@
       <w:pPr>
         <w:keepNext/>
       </w:pPr>
-      <w:hyperlink r:id="rId104">
+      <w:hyperlink r:id="rId116">
         <w:r>
           <w:rPr>
             <w:color w:val="245A81"/>
@@ -4032,7 +4464,7 @@
       <w:pPr>
         <w:keepNext/>
       </w:pPr>
-      <w:hyperlink r:id="rId105">
+      <w:hyperlink r:id="rId117">
         <w:r>
           <w:rPr>
             <w:color w:val="245A81"/>
@@ -4115,7 +4547,7 @@
       <w:pPr>
         <w:keepNext/>
       </w:pPr>
-      <w:hyperlink r:id="rId106">
+      <w:hyperlink r:id="rId118">
         <w:r>
           <w:rPr>
             <w:color w:val="245A81"/>
@@ -4140,7 +4572,7 @@
       <w:pPr>
         <w:keepNext/>
       </w:pPr>
-      <w:hyperlink r:id="rId107">
+      <w:hyperlink r:id="rId119">
         <w:r>
           <w:rPr>
             <w:color w:val="245A81"/>
@@ -4198,7 +4630,7 @@
       <w:pPr>
         <w:keepNext/>
       </w:pPr>
-      <w:hyperlink r:id="rId108">
+      <w:hyperlink r:id="rId120">
         <w:r>
           <w:rPr>
             <w:color w:val="245A81"/>
@@ -4223,7 +4655,7 @@
       <w:pPr>
         <w:keepNext/>
       </w:pPr>
-      <w:hyperlink r:id="rId109">
+      <w:hyperlink r:id="rId121">
         <w:r>
           <w:rPr>
             <w:color w:val="245A81"/>
@@ -4248,7 +4680,7 @@
       <w:pPr>
         <w:keepNext/>
       </w:pPr>
-      <w:hyperlink r:id="rId110">
+      <w:hyperlink r:id="rId122">
         <w:r>
           <w:rPr>
             <w:color w:val="245A81"/>
@@ -4306,7 +4738,7 @@
       <w:pPr>
         <w:keepNext/>
       </w:pPr>
-      <w:hyperlink r:id="rId111">
+      <w:hyperlink r:id="rId123">
         <w:r>
           <w:rPr>
             <w:color w:val="245A81"/>
@@ -4331,7 +4763,7 @@
       <w:pPr>
         <w:keepNext/>
       </w:pPr>
-      <w:hyperlink r:id="rId112">
+      <w:hyperlink r:id="rId124">
         <w:r>
           <w:rPr>
             <w:color w:val="245A81"/>
@@ -4389,7 +4821,7 @@
       <w:pPr>
         <w:keepNext/>
       </w:pPr>
-      <w:hyperlink r:id="rId113">
+      <w:hyperlink r:id="rId125">
         <w:r>
           <w:rPr>
             <w:color w:val="245A81"/>
@@ -4414,7 +4846,7 @@
       <w:pPr>
         <w:keepNext/>
       </w:pPr>
-      <w:hyperlink r:id="rId114">
+      <w:hyperlink r:id="rId126">
         <w:r>
           <w:rPr>
             <w:color w:val="245A81"/>
@@ -4472,7 +4904,7 @@
       <w:pPr>
         <w:keepNext/>
       </w:pPr>
-      <w:hyperlink r:id="rId115">
+      <w:hyperlink r:id="rId127">
         <w:r>
           <w:rPr>
             <w:color w:val="245A81"/>
@@ -4497,7 +4929,7 @@
       <w:pPr>
         <w:keepNext/>
       </w:pPr>
-      <w:hyperlink r:id="rId116">
+      <w:hyperlink r:id="rId128">
         <w:r>
           <w:rPr>
             <w:color w:val="245A81"/>
@@ -4563,7 +4995,7 @@
       <w:pPr>
         <w:keepNext/>
       </w:pPr>
-      <w:hyperlink r:id="rId117">
+      <w:hyperlink r:id="rId129">
         <w:r>
           <w:rPr>
             <w:color w:val="245A81"/>
@@ -4588,7 +5020,7 @@
       <w:pPr>
         <w:keepNext/>
       </w:pPr>
-      <w:hyperlink r:id="rId118">
+      <w:hyperlink r:id="rId130">
         <w:r>
           <w:rPr>
             <w:color w:val="245A81"/>
@@ -4671,7 +5103,7 @@
       <w:pPr>
         <w:keepNext/>
       </w:pPr>
-      <w:hyperlink r:id="rId119">
+      <w:hyperlink r:id="rId131">
         <w:r>
           <w:rPr>
             <w:color w:val="245A81"/>
@@ -4729,7 +5161,7 @@
       <w:pPr>
         <w:keepNext/>
       </w:pPr>
-      <w:hyperlink r:id="rId120">
+      <w:hyperlink r:id="rId132">
         <w:r>
           <w:rPr>
             <w:color w:val="245A81"/>
@@ -4754,7 +5186,7 @@
       <w:pPr>
         <w:keepNext/>
       </w:pPr>
-      <w:hyperlink r:id="rId121">
+      <w:hyperlink r:id="rId133">
         <w:r>
           <w:rPr>
             <w:color w:val="245A81"/>
@@ -4812,7 +5244,7 @@
       <w:pPr>
         <w:keepNext/>
       </w:pPr>
-      <w:hyperlink r:id="rId122">
+      <w:hyperlink r:id="rId134">
         <w:r>
           <w:rPr>
             <w:color w:val="245A81"/>
@@ -4870,7 +5302,7 @@
       <w:pPr>
         <w:keepNext/>
       </w:pPr>
-      <w:hyperlink r:id="rId123">
+      <w:hyperlink r:id="rId135">
         <w:r>
           <w:rPr>
             <w:color w:val="245A81"/>
@@ -4895,7 +5327,7 @@
       <w:pPr>
         <w:keepNext/>
       </w:pPr>
-      <w:hyperlink r:id="rId124">
+      <w:hyperlink r:id="rId136">
         <w:r>
           <w:rPr>
             <w:color w:val="245A81"/>
@@ -4953,7 +5385,7 @@
       <w:pPr>
         <w:keepNext/>
       </w:pPr>
-      <w:hyperlink r:id="rId125">
+      <w:hyperlink r:id="rId137">
         <w:r>
           <w:rPr>
             <w:color w:val="245A81"/>
@@ -4978,7 +5410,7 @@
       <w:pPr>
         <w:keepNext/>
       </w:pPr>
-      <w:hyperlink r:id="rId126">
+      <w:hyperlink r:id="rId138">
         <w:r>
           <w:rPr>
             <w:color w:val="245A81"/>
@@ -5036,7 +5468,7 @@
       <w:pPr>
         <w:keepNext/>
       </w:pPr>
-      <w:hyperlink r:id="rId127">
+      <w:hyperlink r:id="rId139">
         <w:r>
           <w:rPr>
             <w:color w:val="245A81"/>
@@ -5119,7 +5551,7 @@
       <w:pPr>
         <w:keepNext/>
       </w:pPr>
-      <w:hyperlink r:id="rId128">
+      <w:hyperlink r:id="rId140">
         <w:r>
           <w:rPr>
             <w:color w:val="245A81"/>
@@ -5144,7 +5576,7 @@
       <w:pPr>
         <w:keepNext/>
       </w:pPr>
-      <w:hyperlink r:id="rId129">
+      <w:hyperlink r:id="rId141">
         <w:r>
           <w:rPr>
             <w:color w:val="245A81"/>
@@ -5202,7 +5634,7 @@
       <w:pPr>
         <w:keepNext/>
       </w:pPr>
-      <w:hyperlink r:id="rId130">
+      <w:hyperlink r:id="rId142">
         <w:r>
           <w:rPr>
             <w:color w:val="245A81"/>
@@ -5285,7 +5717,7 @@
       <w:pPr>
         <w:keepNext/>
       </w:pPr>
-      <w:hyperlink r:id="rId131">
+      <w:hyperlink r:id="rId143">
         <w:r>
           <w:rPr>
             <w:color w:val="245A81"/>
@@ -5310,7 +5742,7 @@
       <w:pPr>
         <w:keepNext/>
       </w:pPr>
-      <w:hyperlink r:id="rId132">
+      <w:hyperlink r:id="rId144">
         <w:r>
           <w:rPr>
             <w:color w:val="245A81"/>
@@ -5368,7 +5800,7 @@
       <w:pPr>
         <w:keepNext/>
       </w:pPr>
-      <w:hyperlink r:id="rId133">
+      <w:hyperlink r:id="rId145">
         <w:r>
           <w:rPr>
             <w:color w:val="245A81"/>
@@ -5393,7 +5825,7 @@
       <w:pPr>
         <w:keepNext/>
       </w:pPr>
-      <w:hyperlink r:id="rId134">
+      <w:hyperlink r:id="rId146">
         <w:r>
           <w:rPr>
             <w:color w:val="245A81"/>
@@ -5451,7 +5883,7 @@
       <w:pPr>
         <w:keepNext/>
       </w:pPr>
-      <w:hyperlink r:id="rId135">
+      <w:hyperlink r:id="rId147">
         <w:r>
           <w:rPr>
             <w:color w:val="245A81"/>
@@ -5509,7 +5941,7 @@
       <w:pPr>
         <w:keepNext/>
       </w:pPr>
-      <w:hyperlink r:id="rId136">
+      <w:hyperlink r:id="rId148">
         <w:r>
           <w:rPr>
             <w:color w:val="245A81"/>
@@ -5534,7 +5966,7 @@
       <w:pPr>
         <w:keepNext/>
       </w:pPr>
-      <w:hyperlink r:id="rId137">
+      <w:hyperlink r:id="rId149">
         <w:r>
           <w:rPr>
             <w:color w:val="245A81"/>
@@ -5592,7 +6024,7 @@
       <w:pPr>
         <w:keepNext/>
       </w:pPr>
-      <w:hyperlink r:id="rId138">
+      <w:hyperlink r:id="rId150">
         <w:r>
           <w:rPr>
             <w:color w:val="245A81"/>
@@ -5617,7 +6049,7 @@
       <w:pPr>
         <w:keepNext/>
       </w:pPr>
-      <w:hyperlink r:id="rId139">
+      <w:hyperlink r:id="rId151">
         <w:r>
           <w:rPr>
             <w:color w:val="245A81"/>
@@ -5683,7 +6115,7 @@
       <w:pPr>
         <w:keepNext/>
       </w:pPr>
-      <w:hyperlink r:id="rId140">
+      <w:hyperlink r:id="rId152">
         <w:r>
           <w:rPr>
             <w:color w:val="245A81"/>
@@ -5741,7 +6173,7 @@
       <w:pPr>
         <w:keepNext/>
       </w:pPr>
-      <w:hyperlink r:id="rId141">
+      <w:hyperlink r:id="rId153">
         <w:r>
           <w:rPr>
             <w:color w:val="245A81"/>
@@ -5799,7 +6231,7 @@
       <w:pPr>
         <w:keepNext/>
       </w:pPr>
-      <w:hyperlink r:id="rId142">
+      <w:hyperlink r:id="rId154">
         <w:r>
           <w:rPr>
             <w:color w:val="245A81"/>
@@ -5824,7 +6256,7 @@
       <w:pPr>
         <w:keepNext/>
       </w:pPr>
-      <w:hyperlink r:id="rId143">
+      <w:hyperlink r:id="rId155">
         <w:r>
           <w:rPr>
             <w:color w:val="245A81"/>
@@ -5907,7 +6339,7 @@
       <w:pPr>
         <w:keepNext/>
       </w:pPr>
-      <w:hyperlink r:id="rId144">
+      <w:hyperlink r:id="rId156">
         <w:r>
           <w:rPr>
             <w:color w:val="245A81"/>
@@ -5998,7 +6430,7 @@
       <w:pPr>
         <w:keepNext/>
       </w:pPr>
-      <w:hyperlink r:id="rId145">
+      <w:hyperlink r:id="rId157">
         <w:r>
           <w:rPr>
             <w:color w:val="245A81"/>
@@ -6056,7 +6488,7 @@
       <w:pPr>
         <w:keepNext/>
       </w:pPr>
-      <w:hyperlink r:id="rId146">
+      <w:hyperlink r:id="rId158">
         <w:r>
           <w:rPr>
             <w:color w:val="245A81"/>
@@ -6081,7 +6513,7 @@
       <w:pPr>
         <w:keepNext/>
       </w:pPr>
-      <w:hyperlink r:id="rId147">
+      <w:hyperlink r:id="rId159">
         <w:r>
           <w:rPr>
             <w:color w:val="245A81"/>
@@ -6139,7 +6571,7 @@
       <w:pPr>
         <w:keepNext/>
       </w:pPr>
-      <w:hyperlink r:id="rId148">
+      <w:hyperlink r:id="rId160">
         <w:r>
           <w:rPr>
             <w:color w:val="245A81"/>
@@ -6164,7 +6596,7 @@
       <w:pPr>
         <w:keepNext/>
       </w:pPr>
-      <w:hyperlink r:id="rId149">
+      <w:hyperlink r:id="rId161">
         <w:r>
           <w:rPr>
             <w:color w:val="245A81"/>
@@ -6222,7 +6654,7 @@
       <w:pPr>
         <w:keepNext/>
       </w:pPr>
-      <w:hyperlink r:id="rId150">
+      <w:hyperlink r:id="rId162">
         <w:r>
           <w:rPr>
             <w:color w:val="245A81"/>
@@ -6288,7 +6720,7 @@
       <w:pPr>
         <w:keepNext/>
       </w:pPr>
-      <w:hyperlink r:id="rId151">
+      <w:hyperlink r:id="rId163">
         <w:r>
           <w:rPr>
             <w:color w:val="245A81"/>
@@ -6313,7 +6745,7 @@
       <w:pPr>
         <w:keepNext/>
       </w:pPr>
-      <w:hyperlink r:id="rId152">
+      <w:hyperlink r:id="rId164">
         <w:r>
           <w:rPr>
             <w:color w:val="245A81"/>
@@ -6371,7 +6803,7 @@
       <w:pPr>
         <w:keepNext/>
       </w:pPr>
-      <w:hyperlink r:id="rId153">
+      <w:hyperlink r:id="rId165">
         <w:r>
           <w:rPr>
             <w:color w:val="245A81"/>
@@ -6396,7 +6828,7 @@
       <w:pPr>
         <w:keepNext/>
       </w:pPr>
-      <w:hyperlink r:id="rId154">
+      <w:hyperlink r:id="rId166">
         <w:r>
           <w:rPr>
             <w:color w:val="245A81"/>
@@ -6454,7 +6886,7 @@
       <w:pPr>
         <w:keepNext/>
       </w:pPr>
-      <w:hyperlink r:id="rId155">
+      <w:hyperlink r:id="rId167">
         <w:r>
           <w:rPr>
             <w:color w:val="245A81"/>
@@ -6537,7 +6969,7 @@
       <w:pPr>
         <w:keepNext/>
       </w:pPr>
-      <w:hyperlink r:id="rId156">
+      <w:hyperlink r:id="rId168">
         <w:r>
           <w:rPr>
             <w:color w:val="245A81"/>
@@ -6595,7 +7027,7 @@
       <w:pPr>
         <w:keepNext/>
       </w:pPr>
-      <w:hyperlink r:id="rId157">
+      <w:hyperlink r:id="rId169">
         <w:r>
           <w:rPr>
             <w:color w:val="245A81"/>
@@ -6620,7 +7052,7 @@
       <w:pPr>
         <w:keepNext/>
       </w:pPr>
-      <w:hyperlink r:id="rId158">
+      <w:hyperlink r:id="rId170">
         <w:r>
           <w:rPr>
             <w:color w:val="245A81"/>
@@ -6678,7 +7110,7 @@
       <w:pPr>
         <w:keepNext/>
       </w:pPr>
-      <w:hyperlink r:id="rId159">
+      <w:hyperlink r:id="rId171">
         <w:r>
           <w:rPr>
             <w:color w:val="245A81"/>
@@ -6703,7 +7135,7 @@
       <w:pPr>
         <w:keepNext/>
       </w:pPr>
-      <w:hyperlink r:id="rId160">
+      <w:hyperlink r:id="rId172">
         <w:r>
           <w:rPr>
             <w:color w:val="245A81"/>
@@ -6769,7 +7201,7 @@
       <w:pPr>
         <w:keepNext/>
       </w:pPr>
-      <w:hyperlink r:id="rId161">
+      <w:hyperlink r:id="rId173">
         <w:r>
           <w:rPr>
             <w:color w:val="245A81"/>
@@ -6794,7 +7226,7 @@
       <w:pPr>
         <w:keepNext/>
       </w:pPr>
-      <w:hyperlink r:id="rId162">
+      <w:hyperlink r:id="rId174">
         <w:r>
           <w:rPr>
             <w:color w:val="245A81"/>
@@ -6852,7 +7284,7 @@
       <w:pPr>
         <w:keepNext/>
       </w:pPr>
-      <w:hyperlink r:id="rId163">
+      <w:hyperlink r:id="rId175">
         <w:r>
           <w:rPr>
             <w:color w:val="245A81"/>
@@ -6877,7 +7309,7 @@
       <w:pPr>
         <w:keepNext/>
       </w:pPr>
-      <w:hyperlink r:id="rId164">
+      <w:hyperlink r:id="rId176">
         <w:r>
           <w:rPr>
             <w:color w:val="245A81"/>
@@ -6935,7 +7367,7 @@
       <w:pPr>
         <w:keepNext/>
       </w:pPr>
-      <w:hyperlink r:id="rId165">
+      <w:hyperlink r:id="rId177">
         <w:r>
           <w:rPr>
             <w:color w:val="245A81"/>
@@ -6960,7 +7392,7 @@
       <w:pPr>
         <w:keepNext/>
       </w:pPr>
-      <w:hyperlink r:id="rId166">
+      <w:hyperlink r:id="rId178">
         <w:r>
           <w:rPr>
             <w:color w:val="245A81"/>
@@ -7018,7 +7450,7 @@
       <w:pPr>
         <w:keepNext/>
       </w:pPr>
-      <w:hyperlink r:id="rId167">
+      <w:hyperlink r:id="rId179">
         <w:r>
           <w:rPr>
             <w:color w:val="245A81"/>
@@ -7043,7 +7475,7 @@
       <w:pPr>
         <w:keepNext/>
       </w:pPr>
-      <w:hyperlink r:id="rId168">
+      <w:hyperlink r:id="rId180">
         <w:r>
           <w:rPr>
             <w:color w:val="245A81"/>
@@ -7101,7 +7533,7 @@
       <w:pPr>
         <w:keepNext/>
       </w:pPr>
-      <w:hyperlink r:id="rId169">
+      <w:hyperlink r:id="rId181">
         <w:r>
           <w:rPr>
             <w:color w:val="245A81"/>
@@ -7126,7 +7558,7 @@
       <w:pPr>
         <w:keepNext/>
       </w:pPr>
-      <w:hyperlink r:id="rId170">
+      <w:hyperlink r:id="rId182">
         <w:r>
           <w:rPr>
             <w:color w:val="245A81"/>
@@ -7192,7 +7624,7 @@
       <w:pPr>
         <w:keepNext/>
       </w:pPr>
-      <w:hyperlink r:id="rId171">
+      <w:hyperlink r:id="rId183">
         <w:r>
           <w:rPr>
             <w:color w:val="245A81"/>
@@ -7217,7 +7649,7 @@
       <w:pPr>
         <w:keepNext/>
       </w:pPr>
-      <w:hyperlink r:id="rId172">
+      <w:hyperlink r:id="rId184">
         <w:r>
           <w:rPr>
             <w:color w:val="245A81"/>
@@ -7275,7 +7707,7 @@
       <w:pPr>
         <w:keepNext/>
       </w:pPr>
-      <w:hyperlink r:id="rId173">
+      <w:hyperlink r:id="rId185">
         <w:r>
           <w:rPr>
             <w:color w:val="245A81"/>
@@ -7300,7 +7732,7 @@
       <w:pPr>
         <w:keepNext/>
       </w:pPr>
-      <w:hyperlink r:id="rId174">
+      <w:hyperlink r:id="rId186">
         <w:r>
           <w:rPr>
             <w:color w:val="245A81"/>
@@ -7383,7 +7815,7 @@
       <w:pPr>
         <w:keepNext/>
       </w:pPr>
-      <w:hyperlink r:id="rId175">
+      <w:hyperlink r:id="rId187">
         <w:r>
           <w:rPr>
             <w:color w:val="245A81"/>
@@ -7441,7 +7873,7 @@
       <w:pPr>
         <w:keepNext/>
       </w:pPr>
-      <w:hyperlink r:id="rId176">
+      <w:hyperlink r:id="rId188">
         <w:r>
           <w:rPr>
             <w:color w:val="245A81"/>
@@ -7466,7 +7898,7 @@
       <w:pPr>
         <w:keepNext/>
       </w:pPr>
-      <w:hyperlink r:id="rId177">
+      <w:hyperlink r:id="rId189">
         <w:r>
           <w:rPr>
             <w:color w:val="245A81"/>
@@ -7524,7 +7956,7 @@
       <w:pPr>
         <w:keepNext/>
       </w:pPr>
-      <w:hyperlink r:id="rId178">
+      <w:hyperlink r:id="rId190">
         <w:r>
           <w:rPr>
             <w:color w:val="245A81"/>
@@ -7549,7 +7981,7 @@
       <w:pPr>
         <w:keepNext/>
       </w:pPr>
-      <w:hyperlink r:id="rId179">
+      <w:hyperlink r:id="rId191">
         <w:r>
           <w:rPr>
             <w:color w:val="245A81"/>
@@ -7615,7 +8047,7 @@
       <w:pPr>
         <w:keepNext/>
       </w:pPr>
-      <w:hyperlink r:id="rId180">
+      <w:hyperlink r:id="rId192">
         <w:r>
           <w:rPr>
             <w:color w:val="245A81"/>
@@ -7698,7 +8130,7 @@
       <w:pPr>
         <w:keepNext/>
       </w:pPr>
-      <w:hyperlink r:id="rId181">
+      <w:hyperlink r:id="rId193">
         <w:r>
           <w:rPr>
             <w:color w:val="245A81"/>
@@ -7723,7 +8155,7 @@
       <w:pPr>
         <w:keepNext/>
       </w:pPr>
-      <w:hyperlink r:id="rId182">
+      <w:hyperlink r:id="rId194">
         <w:r>
           <w:rPr>
             <w:color w:val="245A81"/>
@@ -7781,7 +8213,7 @@
       <w:pPr>
         <w:keepNext/>
       </w:pPr>
-      <w:hyperlink r:id="rId183">
+      <w:hyperlink r:id="rId195">
         <w:r>
           <w:rPr>
             <w:color w:val="245A81"/>
@@ -7839,7 +8271,7 @@
       <w:pPr>
         <w:keepNext/>
       </w:pPr>
-      <w:hyperlink r:id="rId184">
+      <w:hyperlink r:id="rId196">
         <w:r>
           <w:rPr>
             <w:color w:val="245A81"/>
@@ -7864,7 +8296,7 @@
       <w:pPr>
         <w:keepNext/>
       </w:pPr>
-      <w:hyperlink r:id="rId185">
+      <w:hyperlink r:id="rId197">
         <w:r>
           <w:rPr>
             <w:color w:val="245A81"/>
@@ -7922,7 +8354,7 @@
       <w:pPr>
         <w:keepNext/>
       </w:pPr>
-      <w:hyperlink r:id="rId186">
+      <w:hyperlink r:id="rId198">
         <w:r>
           <w:rPr>
             <w:color w:val="245A81"/>
@@ -7980,7 +8412,7 @@
       <w:pPr>
         <w:keepNext/>
       </w:pPr>
-      <w:hyperlink r:id="rId187">
+      <w:hyperlink r:id="rId199">
         <w:r>
           <w:rPr>
             <w:color w:val="245A81"/>
@@ -8005,7 +8437,7 @@
       <w:pPr>
         <w:keepNext/>
       </w:pPr>
-      <w:hyperlink r:id="rId188">
+      <w:hyperlink r:id="rId200">
         <w:r>
           <w:rPr>
             <w:color w:val="245A81"/>
@@ -8063,7 +8495,7 @@
       <w:pPr>
         <w:keepNext/>
       </w:pPr>
-      <w:hyperlink r:id="rId189">
+      <w:hyperlink r:id="rId201">
         <w:r>
           <w:rPr>
             <w:color w:val="245A81"/>
@@ -8129,7 +8561,7 @@
       <w:pPr>
         <w:keepNext/>
       </w:pPr>
-      <w:hyperlink r:id="rId190">
+      <w:hyperlink r:id="rId202">
         <w:r>
           <w:rPr>
             <w:color w:val="245A81"/>
@@ -8154,7 +8586,7 @@
       <w:pPr>
         <w:keepNext/>
       </w:pPr>
-      <w:hyperlink r:id="rId191">
+      <w:hyperlink r:id="rId203">
         <w:r>
           <w:rPr>
             <w:color w:val="245A81"/>
@@ -8212,7 +8644,7 @@
       <w:pPr>
         <w:keepNext/>
       </w:pPr>
-      <w:hyperlink r:id="rId192">
+      <w:hyperlink r:id="rId204">
         <w:r>
           <w:rPr>
             <w:color w:val="245A81"/>
@@ -8237,7 +8669,7 @@
       <w:pPr>
         <w:keepNext/>
       </w:pPr>
-      <w:hyperlink r:id="rId193">
+      <w:hyperlink r:id="rId205">
         <w:r>
           <w:rPr>
             <w:color w:val="245A81"/>
@@ -8295,7 +8727,7 @@
       <w:pPr>
         <w:keepNext/>
       </w:pPr>
-      <w:hyperlink r:id="rId194">
+      <w:hyperlink r:id="rId206">
         <w:r>
           <w:rPr>
             <w:color w:val="245A81"/>
@@ -8353,7 +8785,7 @@
       <w:pPr>
         <w:keepNext/>
       </w:pPr>
-      <w:hyperlink r:id="rId195">
+      <w:hyperlink r:id="rId207">
         <w:r>
           <w:rPr>
             <w:color w:val="245A81"/>

</xml_diff>